<commit_message>
Week 1 Saturday paper: propose three option rewordings where an option eliminated itself
Q13's "Drop Q2 from the analysis", Q15's "the colour of its chart" and Q27's "the p-value
of the field" were options no reader would take, so each item tested one fewer idea than
it printed. paper_edits.yaml proposes a near-miss for each, status proposed with the
reason: comparing the quarters month by month, which keeps the short month; the value in
the previous quarter, a comparison taken for part of a rate's definition; and the value
to fill in, a decision taken for part of a profile. Stems and keys stay as the bank has
them, the key's notes explain the new wording, and the distractor audit still passes.

Co-Authored-By: Claude Opus 5.5 <noreply@anthropic.com>
Claude-Session: https://claude.ai/code/session_01P7zaoR4dQ5pzBFnsX549JQ
</commit_message>
<xml_diff>
--- a/content/W01/SAT/answer-key/C2_W01_SAT_answer_key_TRAINER.docx
+++ b/content/W01/SAT/answer-key/C2_W01_SAT_answer_key_TRAINER.docx
@@ -18574,7 +18574,7 @@
                 <w:sz w:val="21"/>
                 <w:szCs w:val="21"/>
               </w:rPr>
-              <w:t xml:space="preserve">Dropping the quarter drops the question Meera asked.</w:t>
+              <w:t xml:space="preserve">Months carry the same gap: Q2 is two weeks short, so one of its months is short too, and a month-against-month comparison carries the unequal window into every line of it.</w:t>
             </w:r>
           </w:p>
           <w:p>
@@ -18966,7 +18966,7 @@
                 <w:sz w:val="21"/>
                 <w:szCs w:val="21"/>
               </w:rPr>
-              <w:t xml:space="preserve">Presentation, not definition; the chart's colour changes nothing about the number.</w:t>
+              <w:t xml:space="preserve">A previous value is a comparison, made once the rate is defined. The definition is the numerator, the denominator and the window, and two rates compare only when all three match.</w:t>
             </w:r>
           </w:p>
           <w:p>
@@ -21402,7 +21402,7 @@
                 <w:sz w:val="21"/>
                 <w:szCs w:val="21"/>
               </w:rPr>
-              <w:t xml:space="preserve">A p-value belongs to a comparison between groups, not to a field.</w:t>
+              <w:t xml:space="preserve">Filling a gap is a decision, taken after the profile with a written reason. The profile only reports what is there: present, convertible and distinct.</w:t>
             </w:r>
           </w:p>
           <w:p>

</xml_diff>

<commit_message>
Saturday papers: each part's score box beside its rating, whole numerals in the scale, and the markdown twin carries every word the Word paper prints
The answer sheet's step-one grid gains an Items right box per part, so a learner reads their rating
against their score part by part; the key, both discussion guides and exercise-builder say the
marker fills it. Weeks 1 and 2 rebuilt on the builder.

Co-Authored-By: Claude Opus 5.5 <noreply@anthropic.com>
Claude-Session: https://claude.ai/code/session_01P7zaoR4dQ5pzBFnsX549JQ
</commit_message>
<xml_diff>
--- a/content/W01/SAT/answer-key/C2_W01_SAT_answer_key_TRAINER.docx
+++ b/content/W01/SAT/answer-key/C2_W01_SAT_answer_key_TRAINER.docx
@@ -129,7 +129,7 @@
           <w:sz w:val="21"/>
           <w:szCs w:val="21"/>
         </w:rPr>
-        <w:t xml:space="preserve">The marker writes the count of ticks as Items right, out of 54, and hands the paper back.</w:t>
+        <w:t xml:space="preserve">The marker writes each part's ticks in its box beside the learner's rating, and their total as Items right, out of 54, then hands the paper back, so each learner reads their rating against their score part by part.</w:t>
       </w:r>
     </w:p>
     <w:p>
@@ -201,9 +201,9 @@
       </w:tblPr>
       <w:tblGrid>
         <w:gridCol w:w="560"/>
-        <w:gridCol w:w="2050"/>
-        <w:gridCol w:w="1300"/>
-        <w:gridCol w:w="2730"/>
+        <w:gridCol w:w="1800"/>
+        <w:gridCol w:w="1200"/>
+        <w:gridCol w:w="3080"/>
         <w:gridCol w:w="900"/>
         <w:gridCol w:w="680"/>
         <w:gridCol w:w="900"/>
@@ -253,7 +253,7 @@
         </w:tc>
         <w:tc>
           <w:tcPr>
-            <w:tcW w:type="dxa" w:w="2050"/>
+            <w:tcW w:type="dxa" w:w="1800"/>
             <w:tcBorders>
               <w:top w:val="single" w:color="D5D0C4" w:sz="4"/>
               <w:left w:val="single" w:color="D5D0C4" w:sz="4"/>
@@ -290,7 +290,7 @@
         </w:tc>
         <w:tc>
           <w:tcPr>
-            <w:tcW w:type="dxa" w:w="1300"/>
+            <w:tcW w:type="dxa" w:w="1200"/>
             <w:tcBorders>
               <w:top w:val="single" w:color="D5D0C4" w:sz="4"/>
               <w:left w:val="single" w:color="D5D0C4" w:sz="4"/>
@@ -327,7 +327,7 @@
         </w:tc>
         <w:tc>
           <w:tcPr>
-            <w:tcW w:type="dxa" w:w="2730"/>
+            <w:tcW w:type="dxa" w:w="3080"/>
             <w:tcBorders>
               <w:top w:val="single" w:color="D5D0C4" w:sz="4"/>
               <w:left w:val="single" w:color="D5D0C4" w:sz="4"/>
@@ -551,7 +551,7 @@
         </w:tc>
         <w:tc>
           <w:tcPr>
-            <w:tcW w:type="dxa" w:w="2050"/>
+            <w:tcW w:type="dxa" w:w="1800"/>
             <w:tcBorders>
               <w:top w:val="single" w:color="D5D0C4" w:sz="4"/>
               <w:left w:val="single" w:color="D5D0C4" w:sz="4"/>
@@ -587,7 +587,7 @@
         </w:tc>
         <w:tc>
           <w:tcPr>
-            <w:tcW w:type="dxa" w:w="1300"/>
+            <w:tcW w:type="dxa" w:w="1200"/>
             <w:tcBorders>
               <w:top w:val="single" w:color="D5D0C4" w:sz="4"/>
               <w:left w:val="single" w:color="D5D0C4" w:sz="4"/>
@@ -623,7 +623,7 @@
         </w:tc>
         <w:tc>
           <w:tcPr>
-            <w:tcW w:type="dxa" w:w="2730"/>
+            <w:tcW w:type="dxa" w:w="3080"/>
             <w:tcBorders>
               <w:top w:val="single" w:color="D5D0C4" w:sz="4"/>
               <w:left w:val="single" w:color="D5D0C4" w:sz="4"/>
@@ -842,7 +842,7 @@
         </w:tc>
         <w:tc>
           <w:tcPr>
-            <w:tcW w:type="dxa" w:w="2050"/>
+            <w:tcW w:type="dxa" w:w="1800"/>
             <w:tcBorders>
               <w:top w:val="single" w:color="D5D0C4" w:sz="4"/>
               <w:left w:val="single" w:color="D5D0C4" w:sz="4"/>
@@ -878,7 +878,7 @@
         </w:tc>
         <w:tc>
           <w:tcPr>
-            <w:tcW w:type="dxa" w:w="1300"/>
+            <w:tcW w:type="dxa" w:w="1200"/>
             <w:tcBorders>
               <w:top w:val="single" w:color="D5D0C4" w:sz="4"/>
               <w:left w:val="single" w:color="D5D0C4" w:sz="4"/>
@@ -914,7 +914,7 @@
         </w:tc>
         <w:tc>
           <w:tcPr>
-            <w:tcW w:type="dxa" w:w="2730"/>
+            <w:tcW w:type="dxa" w:w="3080"/>
             <w:tcBorders>
               <w:top w:val="single" w:color="D5D0C4" w:sz="4"/>
               <w:left w:val="single" w:color="D5D0C4" w:sz="4"/>
@@ -1133,7 +1133,7 @@
         </w:tc>
         <w:tc>
           <w:tcPr>
-            <w:tcW w:type="dxa" w:w="2050"/>
+            <w:tcW w:type="dxa" w:w="1800"/>
             <w:tcBorders>
               <w:top w:val="single" w:color="D5D0C4" w:sz="4"/>
               <w:left w:val="single" w:color="D5D0C4" w:sz="4"/>
@@ -1169,7 +1169,7 @@
         </w:tc>
         <w:tc>
           <w:tcPr>
-            <w:tcW w:type="dxa" w:w="1300"/>
+            <w:tcW w:type="dxa" w:w="1200"/>
             <w:tcBorders>
               <w:top w:val="single" w:color="D5D0C4" w:sz="4"/>
               <w:left w:val="single" w:color="D5D0C4" w:sz="4"/>
@@ -1205,7 +1205,7 @@
         </w:tc>
         <w:tc>
           <w:tcPr>
-            <w:tcW w:type="dxa" w:w="2730"/>
+            <w:tcW w:type="dxa" w:w="3080"/>
             <w:tcBorders>
               <w:top w:val="single" w:color="D5D0C4" w:sz="4"/>
               <w:left w:val="single" w:color="D5D0C4" w:sz="4"/>
@@ -1424,7 +1424,7 @@
         </w:tc>
         <w:tc>
           <w:tcPr>
-            <w:tcW w:type="dxa" w:w="2050"/>
+            <w:tcW w:type="dxa" w:w="1800"/>
             <w:tcBorders>
               <w:top w:val="single" w:color="D5D0C4" w:sz="4"/>
               <w:left w:val="single" w:color="D5D0C4" w:sz="4"/>
@@ -1460,7 +1460,7 @@
         </w:tc>
         <w:tc>
           <w:tcPr>
-            <w:tcW w:type="dxa" w:w="1300"/>
+            <w:tcW w:type="dxa" w:w="1200"/>
             <w:tcBorders>
               <w:top w:val="single" w:color="D5D0C4" w:sz="4"/>
               <w:left w:val="single" w:color="D5D0C4" w:sz="4"/>
@@ -1496,7 +1496,7 @@
         </w:tc>
         <w:tc>
           <w:tcPr>
-            <w:tcW w:type="dxa" w:w="2730"/>
+            <w:tcW w:type="dxa" w:w="3080"/>
             <w:tcBorders>
               <w:top w:val="single" w:color="D5D0C4" w:sz="4"/>
               <w:left w:val="single" w:color="D5D0C4" w:sz="4"/>
@@ -1715,7 +1715,7 @@
         </w:tc>
         <w:tc>
           <w:tcPr>
-            <w:tcW w:type="dxa" w:w="2050"/>
+            <w:tcW w:type="dxa" w:w="1800"/>
             <w:tcBorders>
               <w:top w:val="single" w:color="D5D0C4" w:sz="4"/>
               <w:left w:val="single" w:color="D5D0C4" w:sz="4"/>
@@ -1751,7 +1751,7 @@
         </w:tc>
         <w:tc>
           <w:tcPr>
-            <w:tcW w:type="dxa" w:w="1300"/>
+            <w:tcW w:type="dxa" w:w="1200"/>
             <w:tcBorders>
               <w:top w:val="single" w:color="D5D0C4" w:sz="4"/>
               <w:left w:val="single" w:color="D5D0C4" w:sz="4"/>
@@ -1787,7 +1787,7 @@
         </w:tc>
         <w:tc>
           <w:tcPr>
-            <w:tcW w:type="dxa" w:w="2730"/>
+            <w:tcW w:type="dxa" w:w="3080"/>
             <w:tcBorders>
               <w:top w:val="single" w:color="D5D0C4" w:sz="4"/>
               <w:left w:val="single" w:color="D5D0C4" w:sz="4"/>
@@ -2006,7 +2006,7 @@
         </w:tc>
         <w:tc>
           <w:tcPr>
-            <w:tcW w:type="dxa" w:w="2050"/>
+            <w:tcW w:type="dxa" w:w="1800"/>
             <w:tcBorders>
               <w:top w:val="single" w:color="D5D0C4" w:sz="4"/>
               <w:left w:val="single" w:color="D5D0C4" w:sz="4"/>
@@ -2042,7 +2042,7 @@
         </w:tc>
         <w:tc>
           <w:tcPr>
-            <w:tcW w:type="dxa" w:w="1300"/>
+            <w:tcW w:type="dxa" w:w="1200"/>
             <w:tcBorders>
               <w:top w:val="single" w:color="D5D0C4" w:sz="4"/>
               <w:left w:val="single" w:color="D5D0C4" w:sz="4"/>
@@ -2078,7 +2078,7 @@
         </w:tc>
         <w:tc>
           <w:tcPr>
-            <w:tcW w:type="dxa" w:w="2730"/>
+            <w:tcW w:type="dxa" w:w="3080"/>
             <w:tcBorders>
               <w:top w:val="single" w:color="D5D0C4" w:sz="4"/>
               <w:left w:val="single" w:color="D5D0C4" w:sz="4"/>
@@ -2299,7 +2299,7 @@
         </w:tc>
         <w:tc>
           <w:tcPr>
-            <w:tcW w:type="dxa" w:w="2050"/>
+            <w:tcW w:type="dxa" w:w="1800"/>
             <w:tcBorders>
               <w:top w:val="single" w:color="D5D0C4" w:sz="4"/>
               <w:left w:val="single" w:color="D5D0C4" w:sz="4"/>
@@ -2335,7 +2335,7 @@
         </w:tc>
         <w:tc>
           <w:tcPr>
-            <w:tcW w:type="dxa" w:w="1300"/>
+            <w:tcW w:type="dxa" w:w="1200"/>
             <w:tcBorders>
               <w:top w:val="single" w:color="D5D0C4" w:sz="4"/>
               <w:left w:val="single" w:color="D5D0C4" w:sz="4"/>
@@ -2371,7 +2371,7 @@
         </w:tc>
         <w:tc>
           <w:tcPr>
-            <w:tcW w:type="dxa" w:w="2730"/>
+            <w:tcW w:type="dxa" w:w="3080"/>
             <w:tcBorders>
               <w:top w:val="single" w:color="D5D0C4" w:sz="4"/>
               <w:left w:val="single" w:color="D5D0C4" w:sz="4"/>

</xml_diff>

<commit_message>
Saturday papers: relabel seven more-than-one items so no letter sits in every such key
Every more-than-one key in Week 1 held a and b, and every one in Week 2 held a, so ticking those
letters always scored. paper_edits.yaml gains an order edit, guarded by from_key, which relabels an
item's options and moves the key's letters and the reasons with them; four Week 1 items and three
Week 2 items use it, status proposed. distractor_audit.py now fails a recap paper where one letter
sits in every more-than-one key across four or more such items. Both provenance files record the
change, and exercise-builder states the rule.

Co-Authored-By: Claude Opus 5.5 <noreply@anthropic.com>
Claude-Session: https://claude.ai/code/session_01P7zaoR4dQ5pzBFnsX549JQ
</commit_message>
<xml_diff>
--- a/content/W01/SAT/answer-key/C2_W01_SAT_answer_key_TRAINER.docx
+++ b/content/W01/SAT/answer-key/C2_W01_SAT_answer_key_TRAINER.docx
@@ -7391,7 +7391,7 @@
                 <w:sz w:val="18"/>
                 <w:szCs w:val="18"/>
               </w:rPr>
-              <w:t xml:space="preserve">A, B, C</w:t>
+              <w:t xml:space="preserve">B, C, D</w:t>
             </w:r>
           </w:p>
         </w:tc>
@@ -10301,7 +10301,7 @@
                 <w:sz w:val="18"/>
                 <w:szCs w:val="18"/>
               </w:rPr>
-              <w:t xml:space="preserve">A, B, C</w:t>
+              <w:t xml:space="preserve">A, C, D</w:t>
             </w:r>
           </w:p>
         </w:tc>
@@ -15539,7 +15539,7 @@
                 <w:sz w:val="18"/>
                 <w:szCs w:val="18"/>
               </w:rPr>
-              <w:t xml:space="preserve">A, B, C</w:t>
+              <w:t xml:space="preserve">B, C, D</w:t>
             </w:r>
           </w:p>
         </w:tc>
@@ -15830,7 +15830,7 @@
                 <w:sz w:val="18"/>
                 <w:szCs w:val="18"/>
               </w:rPr>
-              <w:t xml:space="preserve">A, B, D</w:t>
+              <w:t xml:space="preserve">A, C, D</w:t>
             </w:r>
           </w:p>
         </w:tc>
@@ -21698,7 +21698,7 @@
                 <w:sz w:val="21"/>
                 <w:szCs w:val="21"/>
               </w:rPr>
-              <w:t xml:space="preserve">   Key A, B, C</w:t>
+              <w:t xml:space="preserve">   Key B, C, D</w:t>
             </w:r>
             <w:r>
               <w:rPr>
@@ -21751,7 +21751,7 @@
                 <w:sz w:val="20"/>
                 <w:szCs w:val="20"/>
               </w:rPr>
-              <w:t xml:space="preserve">D.  </w:t>
+              <w:t xml:space="preserve">A.  </w:t>
             </w:r>
             <w:r>
               <w:rPr>
@@ -23853,7 +23853,7 @@
                 <w:sz w:val="21"/>
                 <w:szCs w:val="21"/>
               </w:rPr>
-              <w:t xml:space="preserve">   Key A, B, C</w:t>
+              <w:t xml:space="preserve">   Key A, C, D</w:t>
             </w:r>
             <w:r>
               <w:rPr>
@@ -23906,7 +23906,7 @@
                 <w:sz w:val="20"/>
                 <w:szCs w:val="20"/>
               </w:rPr>
-              <w:t xml:space="preserve">D.  </w:t>
+              <w:t xml:space="preserve">B.  </w:t>
             </w:r>
             <w:r>
               <w:rPr>
@@ -27678,7 +27678,7 @@
                 <w:sz w:val="21"/>
                 <w:szCs w:val="21"/>
               </w:rPr>
-              <w:t xml:space="preserve">   Key A, B, C</w:t>
+              <w:t xml:space="preserve">   Key B, C, D</w:t>
             </w:r>
             <w:r>
               <w:rPr>
@@ -27731,7 +27731,7 @@
                 <w:sz w:val="20"/>
                 <w:szCs w:val="20"/>
               </w:rPr>
-              <w:t xml:space="preserve">D.  </w:t>
+              <w:t xml:space="preserve">A.  </w:t>
             </w:r>
             <w:r>
               <w:rPr>
@@ -27853,7 +27853,7 @@
                 <w:sz w:val="21"/>
                 <w:szCs w:val="21"/>
               </w:rPr>
-              <w:t xml:space="preserve">   Key A, B, D</w:t>
+              <w:t xml:space="preserve">   Key A, C, D</w:t>
             </w:r>
             <w:r>
               <w:rPr>
@@ -27906,7 +27906,7 @@
                 <w:sz w:val="20"/>
                 <w:szCs w:val="20"/>
               </w:rPr>
-              <w:t xml:space="preserve">C.  </w:t>
+              <w:t xml:space="preserve">B.  </w:t>
             </w:r>
             <w:r>
               <w:rPr>
@@ -32021,7 +32021,7 @@
                       <w:sz w:val="16"/>
                       <w:szCs w:val="16"/>
                     </w:rPr>
-                    <w:t xml:space="preserve">X</w:t>
+                    <w:t xml:space="preserve"/>
                   </w:r>
                 </w:p>
               </w:tc>
@@ -32126,7 +32126,7 @@
                       <w:sz w:val="16"/>
                       <w:szCs w:val="16"/>
                     </w:rPr>
-                    <w:t xml:space="preserve"/>
+                    <w:t xml:space="preserve">X</w:t>
                   </w:r>
                 </w:p>
               </w:tc>
@@ -33745,7 +33745,7 @@
                       <w:sz w:val="16"/>
                       <w:szCs w:val="16"/>
                     </w:rPr>
-                    <w:t xml:space="preserve">X</w:t>
+                    <w:t xml:space="preserve"/>
                   </w:r>
                 </w:p>
               </w:tc>
@@ -33815,7 +33815,7 @@
                       <w:sz w:val="16"/>
                       <w:szCs w:val="16"/>
                     </w:rPr>
-                    <w:t xml:space="preserve"/>
+                    <w:t xml:space="preserve">X</w:t>
                   </w:r>
                 </w:p>
               </w:tc>
@@ -36123,7 +36123,7 @@
                       <w:sz w:val="16"/>
                       <w:szCs w:val="16"/>
                     </w:rPr>
-                    <w:t xml:space="preserve">X</w:t>
+                    <w:t xml:space="preserve"/>
                   </w:r>
                 </w:p>
               </w:tc>
@@ -36228,7 +36228,7 @@
                       <w:sz w:val="16"/>
                       <w:szCs w:val="16"/>
                     </w:rPr>
-                    <w:t xml:space="preserve"/>
+                    <w:t xml:space="preserve">X</w:t>
                   </w:r>
                 </w:p>
               </w:tc>
@@ -36339,7 +36339,7 @@
                       <w:sz w:val="16"/>
                       <w:szCs w:val="16"/>
                     </w:rPr>
-                    <w:t xml:space="preserve">X</w:t>
+                    <w:t xml:space="preserve"/>
                   </w:r>
                 </w:p>
               </w:tc>
@@ -36374,7 +36374,7 @@
                       <w:sz w:val="16"/>
                       <w:szCs w:val="16"/>
                     </w:rPr>
-                    <w:t xml:space="preserve"/>
+                    <w:t xml:space="preserve">X</w:t>
                   </w:r>
                 </w:p>
               </w:tc>

</xml_diff>

<commit_message>
Week 1 Saturday paper v5: three wordings a sitting could argue, closed
Q2's rule now counts consumer orders, so the Rs 4,80,000 store order cannot
flip the call. Q8 and Q10 say which check shows the loss and which cannot,
where "only" overstated it: a rupee total would also catch Q8's lost row. Q19
asks what the analyst's note should say. Keys, proofs and Word files rebuilt;
the audit, the proofs and verify pass.

Co-Authored-By: Claude Opus 5.5 <noreply@anthropic.com>
Claude-Session: https://claude.ai/code/session_01P7zaoR4dQ5pzBFnsX549JQ
</commit_message>
<xml_diff>
--- a/content/W01/SAT/answer-key/C2_W01_SAT_answer_key_TRAINER.docx
+++ b/content/W01/SAT/answer-key/C2_W01_SAT_answer_key_TRAINER.docx
@@ -14648,7 +14648,7 @@
                 <w:sz w:val="21"/>
                 <w:szCs w:val="21"/>
               </w:rPr>
-              <w:t xml:space="preserve">csv.DictReader reads the header line itself, to name the fields, so the first next() hands back the first order, KR-02001, and the comment is wrong about what it skips. The list holds the other 200 rows and starts at KR-02002. The pass counts what it was given, so its report closes on 200 whatever happens, and the order lost at the read sits in neither the clean file nor the log. Only a count taken from the file, 201 rows, set against the 200 the pass received shows the loss: a reconciliation that starts one row short still closes.</w:t>
+              <w:t xml:space="preserve">csv.DictReader reads the header line itself, to name the fields, so the first next() hands back the first order, KR-02001, and the comment is wrong about what it skips. The list holds the other 200 rows and starts at KR-02002. The pass counts what it was given, so its report closes on 200 whatever happens, and the order lost at the read sits in neither the clean file nor the log. A count taken from the file, 201 rows, set against the 200 the pass received shows the loss, where the pass's own report cannot: a reconciliation that starts one row short still closes.</w:t>
             </w:r>
           </w:p>
           <w:p>
@@ -15106,7 +15106,7 @@
                 <w:sz w:val="21"/>
                 <w:szCs w:val="21"/>
               </w:rPr>
-              <w:t xml:space="preserve">rows.copy() makes a new list whose two slots point at the same two dictionaries, a shallow copy, and the pass rewrites each dictionary's amount in place. By the time the rejects line reads as_arrived, KR-02063's amount is the integer 0, whose text is a digit, so the list comes back empty and the line prints 2 + 0 = 2 []. The pass has turned an unreadable amount into a Rs 0 sale, Wednesday's round 1 trap, and the shallow copy has erased the evidence the check was meant to read, so the rows reconcile by construction. Only the rupees can show it: the clean rows hold Rs 3,150 where Anand's books hold both orders. With copies of the dictionaries, [dict(r) for r in rows], or the file itself, the line would print 2 + 1 = 2 and fail on sight.</w:t>
+              <w:t xml:space="preserve">rows.copy() makes a new list whose two slots point at the same two dictionaries, a shallow copy, and the pass rewrites each dictionary's amount in place. By the time the rejects line reads as_arrived, KR-02063's amount is the integer 0, whose text is a digit, so the list comes back empty and the line prints 2 + 0 = 2 []. The pass has turned an unreadable amount into a Rs 0 sale, Wednesday's round 1 trap, and the shallow copy has erased the evidence the check was meant to read, so the rows reconcile by construction. The rupees show it where the rows cannot: the clean rows hold Rs 3,150 where Anand's books hold both orders. With copies of the dictionaries, [dict(r) for r in rows], or the file itself, the line would print 2 + 1 = 2 and fail on sight.</w:t>
             </w:r>
           </w:p>
           <w:p>
@@ -21096,7 +21096,7 @@
           <w:sz w:val="21"/>
           <w:szCs w:val="21"/>
         </w:rPr>
-        <w:t xml:space="preserve">Q2 (One correct option, Hard, [F]): Every Kalpa order carries a status: delivered (it reached the customer), returned (it came back for a refund) or cancelled (it never left the shelf). Meera will fund one of two asks next quarter, the app team's new checkout or the store team's refit. Her rule is to back the channel whose orders brought in more on Monday, counting every order that was not cancelled. The analyst wrote this cell to settle it. What does it print, and which channel does her rule back?</w:t>
+        <w:t xml:space="preserve">Q2 (One correct option, Hard, [F]): Every Kalpa order carries a status: delivered (it reached the customer), returned (it came back for a refund) or cancelled (it never left the shelf). Meera will fund one of two asks next quarter, the app team's new checkout or the store team's refit. Her rule is to back the channel whose consumer orders brought in more on Monday, counting every order that was not cancelled. The analyst wrote this cell to settle it. What does it print, and which channel does her rule back?</w:t>
       </w:r>
     </w:p>
     <w:p>
@@ -21343,7 +21343,7 @@
           <w:sz w:val="21"/>
           <w:szCs w:val="21"/>
         </w:rPr>
-        <w:t xml:space="preserve">Q19 (One correct option, Hard, [S]): Thursday's ten cards held five members' Q1 spend and five other members' Q2 spend, and in class 21 of 1,000 shuffles reached the real gap of Rs 880, under Kavya's 0.05. An analyst reruns the test with the gap written as Q2 less Q1, the way a fall is usually shown. What does the cell print, and what should the note to Meera say about the fall?</w:t>
+        <w:t xml:space="preserve">Q19 (One correct option, Hard, [S]): Thursday's ten cards held five members' Q1 spend and five other members' Q2 spend, and in class 21 of 1,000 shuffles reached the real gap of Rs 880, under Kavya's 0.05. An analyst reruns the test with the gap written as Q2 less Q1, the way a fall is usually shown. What does the cell print, and what should the analyst's note say about the fall?</w:t>
       </w:r>
     </w:p>
     <w:p>

</xml_diff>

<commit_message>
W01 SAT: each part named by the question it asks, and each opening says who needs the answer
Part titles become plain questions (where Kalpa's revenue went between the
quarters; whether Kalpa booked Rs 2.1 or 1.9 crore in the first quarter;
whether the Retail-Plus fall is more than chance and what Meera's note says;
which check would have caught the misleading number in five public cases;
whether a delivery company's offer raised spending and its agent's numbers are
right). The openings name who needs each answer and what rides on it, define
booked value as the dossier's GMV, the quarters, the ladder and profiling, and
Kavya's test becomes flips of each member's own two quarters. Paper, key, Word
files and workbook rebuilt with the builder.

Co-Authored-By: Claude Opus 5.5 <noreply@anthropic.com>
Claude-Session: https://claude.ai/code/session_01K8RZ1KXh1k8mKVCEBq4phk
</commit_message>
<xml_diff>
--- a/content/W01/SAT/answer-key/C2_W01_SAT_answer_key_TRAINER.docx
+++ b/content/W01/SAT/answer-key/C2_W01_SAT_answer_key_TRAINER.docx
@@ -581,7 +581,7 @@
                 <w:sz w:val="18"/>
                 <w:szCs w:val="18"/>
               </w:rPr>
-              <w:t xml:space="preserve">Where the revenue went</w:t>
+              <w:t xml:space="preserve">Where did Kalpa's revenue go between the first quarter and the second?</w:t>
             </w:r>
           </w:p>
         </w:tc>
@@ -872,7 +872,7 @@
                 <w:sz w:val="18"/>
                 <w:szCs w:val="18"/>
               </w:rPr>
-              <w:t xml:space="preserve">Which Q1 figure is right</w:t>
+              <w:t xml:space="preserve">Did Kalpa book Rs 2.1 crore in the first quarter, or Rs 1.9 crore?</w:t>
             </w:r>
           </w:p>
         </w:tc>
@@ -944,7 +944,7 @@
                 <w:sz w:val="18"/>
                 <w:szCs w:val="18"/>
               </w:rPr>
-              <w:t xml:space="preserve">whether you read an export as an auditor will and close its rows and its rupees</w:t>
+              <w:t xml:space="preserve">whether you can check an export the way an auditor would, row by row and rupee by rupee</w:t>
             </w:r>
           </w:p>
         </w:tc>
@@ -1163,7 +1163,7 @@
                 <w:sz w:val="18"/>
                 <w:szCs w:val="18"/>
               </w:rPr>
-              <w:t xml:space="preserve">Real, or the wobble</w:t>
+              <w:t xml:space="preserve">Is the Retail-Plus fall more than chance, and what should Meera's note say?</w:t>
             </w:r>
           </w:p>
         </w:tc>
@@ -1235,7 +1235,7 @@
                 <w:sz w:val="18"/>
                 <w:szCs w:val="18"/>
               </w:rPr>
-              <w:t xml:space="preserve">whether you can say what a shuffle, a count and a fair test let you tell Meera</w:t>
+              <w:t xml:space="preserve">whether you can say what a chance test, a count and a fair comparison let you tell Meera</w:t>
             </w:r>
           </w:p>
         </w:tc>
@@ -1454,7 +1454,7 @@
                 <w:sz w:val="18"/>
                 <w:szCs w:val="18"/>
               </w:rPr>
-              <w:t xml:space="preserve">The same traps, in public</w:t>
+              <w:t xml:space="preserve">Which check would have caught the misleading number in five public cases?</w:t>
             </w:r>
           </w:p>
         </w:tc>
@@ -1526,7 +1526,7 @@
                 <w:sz w:val="18"/>
                 <w:szCs w:val="18"/>
               </w:rPr>
-              <w:t xml:space="preserve">whether you spot the week's traps in public cases and name the check for each</w:t>
+              <w:t xml:space="preserve">whether you can spot the week's mistakes in public cases and name the check for each</w:t>
             </w:r>
           </w:p>
         </w:tc>
@@ -1745,7 +1745,7 @@
                 <w:sz w:val="18"/>
                 <w:szCs w:val="18"/>
               </w:rPr>
-              <w:t xml:space="preserve">An offer, an agent and its logs</w:t>
+              <w:t xml:space="preserve">Did a delivery company's offer raise spending, and are its AI agent's numbers right?</w:t>
             </w:r>
           </w:p>
         </w:tc>
@@ -20969,7 +20969,7 @@
           <w:sz w:val="21"/>
           <w:szCs w:val="21"/>
         </w:rPr>
-        <w:t xml:space="preserve">Part 1, Where the revenue went (7): Q1, Q2, Q3, Q4, Q5, Q6, Q7</w:t>
+        <w:t xml:space="preserve">Part 1, Where did Kalpa's revenue go between the first quarter and the second? (7): Q1, Q2, Q3, Q4, Q5, Q6, Q7</w:t>
       </w:r>
     </w:p>
     <w:p>
@@ -20988,7 +20988,7 @@
           <w:sz w:val="21"/>
           <w:szCs w:val="21"/>
         </w:rPr>
-        <w:t xml:space="preserve">Part 2, Which Q1 figure is right (8): Q8, Q9, Q10, Q11, Q12, Q13, Q14, Q15</w:t>
+        <w:t xml:space="preserve">Part 2, Did Kalpa book Rs 2.1 crore in the first quarter, or Rs 1.9 crore? (8): Q8, Q9, Q10, Q11, Q12, Q13, Q14, Q15</w:t>
       </w:r>
     </w:p>
     <w:p>
@@ -21007,7 +21007,7 @@
           <w:sz w:val="21"/>
           <w:szCs w:val="21"/>
         </w:rPr>
-        <w:t xml:space="preserve">Part 3, Real, or the wobble (6): Q16, Q17, Q18, Q19, Q20, Q21</w:t>
+        <w:t xml:space="preserve">Part 3, Is the Retail-Plus fall more than chance, and what should Meera's note say? (6): Q16, Q17, Q18, Q19, Q20, Q21</w:t>
       </w:r>
     </w:p>
     <w:p>
@@ -21026,7 +21026,7 @@
           <w:sz w:val="21"/>
           <w:szCs w:val="21"/>
         </w:rPr>
-        <w:t xml:space="preserve">Part 4, The same traps, in public (5): Q22, Q23, Q24, Q25, Q26</w:t>
+        <w:t xml:space="preserve">Part 4, Which check would have caught the misleading number in five public cases? (5): Q22, Q23, Q24, Q25, Q26</w:t>
       </w:r>
     </w:p>
     <w:p>
@@ -21045,7 +21045,7 @@
           <w:sz w:val="21"/>
           <w:szCs w:val="21"/>
         </w:rPr>
-        <w:t xml:space="preserve">Part 5, An offer, an agent and its logs (9): Q27, Q28, Q29, Q30, Q31, Q32, Q33, Q34, Q35</w:t>
+        <w:t xml:space="preserve">Part 5, Did a delivery company's offer raise spending, and are its AI agent's numbers right? (9): Q27, Q28, Q29, Q30, Q31, Q32, Q33, Q34, Q35</w:t>
       </w:r>
     </w:p>
     <w:p>

</xml_diff>

<commit_message>
W01 SAT: the humanizer's read over the paper, the key's reasons and the discussion guide
The key's wrong-option reasons lose their 'Right X, wrong Y:' labels and noun
fragments and read as full sentences; negation tails (', never ...') and staged
openers go from the reasons and the interview answers; Set 1's three messages
read as sentences; the watch-list words (actually, quietly, key as an
adjective) go. In the discussion guide every table cell of prose becomes a
sentence, the most-missed column says what most papers get wrong, the one-word
emphasis and the closing aphorism go, and the paragraph on the paper names each
part by its question. Option texts are unchanged, so the audit's spread holds.

Co-Authored-By: Claude Opus 5.5 <noreply@anthropic.com>
Claude-Session: https://claude.ai/code/session_01K8RZ1KXh1k8mKVCEBq4phk
</commit_message>
<xml_diff>
--- a/content/W01/SAT/answer-key/C2_W01_SAT_answer_key_TRAINER.docx
+++ b/content/W01/SAT/answer-key/C2_W01_SAT_answer_key_TRAINER.docx
@@ -13449,7 +13449,7 @@
                 <w:sz w:val="20"/>
                 <w:szCs w:val="20"/>
               </w:rPr>
-              <w:t xml:space="preserve">The median of all 30 with cancelled and returned orders at zero; the model's own rates take those off, so they would come off twice.</w:t>
+              <w:t xml:space="preserve">This is the median of all 30 with cancelled and returned orders at zero, and the model's own rates already take those off, so they would come off twice.</w:t>
             </w:r>
           </w:p>
           <w:p>
@@ -13476,7 +13476,7 @@
                 <w:sz w:val="20"/>
                 <w:szCs w:val="20"/>
               </w:rPr>
-              <w:t xml:space="preserve">The mean of all 30, which carries cancelled and refunded orders and sits eight times above a typical order because of one sale.</w:t>
+              <w:t xml:space="preserve">This is the mean of all 30, which carries cancelled and refunded orders and sits eight times above a typical order because of one sale.</w:t>
             </w:r>
           </w:p>
           <w:p>
@@ -13503,7 +13503,7 @@
                 <w:sz w:val="20"/>
                 <w:szCs w:val="20"/>
               </w:rPr>
-              <w:t xml:space="preserve">The median once the Business order is deleted, which removes a real sale from a model that covers business buyers.</w:t>
+              <w:t xml:space="preserve">This is the median once the Business order is deleted, which removes a real sale from a model that covers business buyers.</w:t>
             </w:r>
           </w:p>
           <w:p>
@@ -13530,7 +13530,7 @@
                 <w:sz w:val="20"/>
                 <w:szCs w:val="20"/>
               </w:rPr>
-              <w:t xml:space="preserve">The 12th value, one place past the middle of 21.</w:t>
+              <w:t xml:space="preserve">This is the 12th value, one place past the middle of 21.</w:t>
             </w:r>
           </w:p>
           <w:p>
@@ -13557,7 +13557,7 @@
                 <w:sz w:val="20"/>
                 <w:szCs w:val="20"/>
               </w:rPr>
-              <w:t xml:space="preserve">The median of the 26 orders delivered or returned, which counts refunded orders as standing when the model's return rate already takes them off.</w:t>
+              <w:t xml:space="preserve">This is the median of the 26 orders delivered or returned, which counts refunded orders as standing when the model's return rate already takes them off.</w:t>
             </w:r>
           </w:p>
           <w:p>
@@ -13584,7 +13584,7 @@
                 <w:sz w:val="20"/>
                 <w:szCs w:val="20"/>
               </w:rPr>
-              <w:t xml:space="preserve">The median of all 30, which counts orders Kalpa was never paid for or refunded.</w:t>
+              <w:t xml:space="preserve">This is the median of all 30, which counts orders Kalpa was never paid for or refunded.</w:t>
             </w:r>
           </w:p>
           <w:p>
@@ -13611,7 +13611,7 @@
                 <w:sz w:val="20"/>
                 <w:szCs w:val="20"/>
               </w:rPr>
-              <w:t xml:space="preserve">The right orders and the wrong statistic: one Business order lifts the delivered mean to twelve times the typical order.</w:t>
+              <w:t xml:space="preserve">Takes the right orders and the mean of them, which one Business order lifts to twelve times the typical order.</w:t>
             </w:r>
           </w:p>
           <w:p>
@@ -14526,7 +14526,7 @@
                 <w:sz w:val="21"/>
                 <w:szCs w:val="21"/>
               </w:rPr>
-              <w:t xml:space="preserve">Checked, like with like, decompose, isolate, hypothesise: most people skip the second rung.</w:t>
+              <w:t xml:space="preserve">I check each figure, set the two side by side on like terms, decompose, isolate and only then hypothesise, and the rung most people skip is the second.</w:t>
             </w:r>
           </w:p>
           <w:p>
@@ -15820,7 +15820,7 @@
                 <w:sz w:val="21"/>
                 <w:szCs w:val="21"/>
               </w:rPr>
-              <w:t xml:space="preserve">Profile, decide each defect with a reason, reconcile, then recompute and send: a figure that leaves before its rows and rupees tie out is one Finance can overturn.</w:t>
+              <w:t xml:space="preserve">The pass profiles each field, decides each defect with a reason, reconciles, and only then recomputes and sends: a figure that leaves before its rows and rupees tie out is one Finance can overturn.</w:t>
             </w:r>
           </w:p>
           <w:p>
@@ -15900,7 +15900,7 @@
                 <w:sz w:val="21"/>
                 <w:szCs w:val="21"/>
               </w:rPr>
-              <w:t xml:space="preserve">Profile, decide, reconcile, recompute: the reconciliation comes before any number leaves.</w:t>
+              <w:t xml:space="preserve">I profile, decide, reconcile and only then recompute, because the reconciliation comes before any number leaves.</w:t>
             </w:r>
           </w:p>
           <w:p>
@@ -16049,7 +16049,7 @@
                 <w:sz w:val="20"/>
                 <w:szCs w:val="20"/>
               </w:rPr>
-              <w:t xml:space="preserve">Tuesday's honest number on Tuesday's data; the reconciliation took Rs 20,00,000 out of Q1.</w:t>
+              <w:t xml:space="preserve">This was Tuesday's honest number on Tuesday's data, and the reconciliation has since taken Rs 20,00,000 out of Q1.</w:t>
             </w:r>
           </w:p>
           <w:p>
@@ -16076,7 +16076,7 @@
                 <w:sz w:val="20"/>
                 <w:szCs w:val="20"/>
               </w:rPr>
-              <w:t xml:space="preserve">The tile's weekly rate against Q1's, which levels the windows and keeps the copies.</w:t>
+              <w:t xml:space="preserve">This is the tile's weekly rate against Q1's, which levels the windows and keeps the copies.</w:t>
             </w:r>
           </w:p>
           <w:p>
@@ -16103,7 +16103,7 @@
                 <w:sz w:val="20"/>
                 <w:szCs w:val="20"/>
               </w:rPr>
-              <w:t xml:space="preserve">The tile's figure, 11 weeks of Q2 against 13 of Q1, with a Q1 still holding its copied rows.</w:t>
+              <w:t xml:space="preserve">This is the tile's figure, 11 weeks of Q2 against 13 of Q1, with a Q1 still holding its copied rows.</w:t>
             </w:r>
           </w:p>
           <w:p>
@@ -18743,7 +18743,7 @@
                 <w:sz w:val="21"/>
                 <w:szCs w:val="21"/>
               </w:rPr>
-              <w:t xml:space="preserve">The ladder's first rung applies to good news too: confirm the change is real before acting on it. Such alerts usually signal a bug, the article says, so the first checks are the plumbing: revenue logged the same way in both groups, users split as planned, nothing broken in either version. In Bing's case the alert was no bug: the checks passed, and the analysis showed revenue up 12 percent, more than 100 million US dollars a year in the United States alone, without hurting key user-experience metrics, the best revenue idea in Bing's history.</w:t>
+              <w:t xml:space="preserve">The ladder's first rung applies to good news too: confirm the change is real before acting on it. Such alerts usually signal a bug, the article says, so the first checks are the plumbing: revenue logged the same way in both groups, users split as planned, nothing broken in either version. In Bing's case the alert was no bug: the checks passed, and the analysis showed revenue up 12 percent, more than 100 million US dollars a year in the United States alone, without hurting the main user-experience metrics, the best revenue idea in Bing's history.</w:t>
             </w:r>
           </w:p>
           <w:p>
@@ -18797,7 +18797,7 @@
                 <w:sz w:val="20"/>
                 <w:szCs w:val="20"/>
               </w:rPr>
-              <w:t xml:space="preserve">The reflex that kills the best ideas: the checks are cheap, and here they showed the lift was real.</w:t>
+              <w:t xml:space="preserve">Discards the test before the cheap checks have run, and here those checks showed the lift was real.</w:t>
             </w:r>
           </w:p>
           <w:p>
@@ -19026,7 +19026,7 @@
                 <w:sz w:val="20"/>
                 <w:szCs w:val="20"/>
               </w:rPr>
-              <w:t xml:space="preserve">Regular customers alone, 250 of them at Rs 20 less each.</w:t>
+              <w:t xml:space="preserve">This counts the regular customers alone, 250 of them at Rs 20 less each.</w:t>
             </w:r>
           </w:p>
           <w:p>
@@ -19053,7 +19053,7 @@
                 <w:sz w:val="20"/>
                 <w:szCs w:val="20"/>
               </w:rPr>
-              <w:t xml:space="preserve">Members alone, 250 of them at Rs 30 less each.</w:t>
+              <w:t xml:space="preserve">This counts the members alone, 250 of them at Rs 30 less each.</w:t>
             </w:r>
           </w:p>
           <w:p>
@@ -19080,7 +19080,7 @@
                 <w:sz w:val="20"/>
                 <w:szCs w:val="20"/>
               </w:rPr>
-              <w:t xml:space="preserve">The blend as it came, Rs 65 more each, with half the offer group members against four in ten of the rest.</w:t>
+              <w:t xml:space="preserve">This is the blend as it came, Rs 65 more each, with half the offer group members against four in ten of the rest.</w:t>
             </w:r>
           </w:p>
           <w:p>
@@ -19996,7 +19996,7 @@
                 <w:sz w:val="20"/>
                 <w:szCs w:val="20"/>
               </w:rPr>
-              <w:t xml:space="preserve">The mean twice over: a typical cost and a cap that both carry C-07's 105 calls.</w:t>
+              <w:t xml:space="preserve">Uses the mean twice, for the typical cost and for the cap, and both carry C-07's 105 calls.</w:t>
             </w:r>
           </w:p>
           <w:p>
@@ -20426,7 +20426,7 @@
                 <w:sz w:val="21"/>
                 <w:szCs w:val="21"/>
               </w:rPr>
-              <w:t xml:space="preserve">COUNT(*) counts rows and COUNT(column) counts values, so a NULL-heavy column undercounts quietly; I say which one a dashboard shows.</w:t>
+              <w:t xml:space="preserve">COUNT(*) counts rows and COUNT(column) counts values, so a column full of NULLs undercounts with no warning; I say which one a dashboard shows.</w:t>
             </w:r>
           </w:p>
           <w:p>
@@ -20750,7 +20750,7 @@
                 <w:sz w:val="20"/>
                 <w:szCs w:val="20"/>
               </w:rPr>
-              <w:t xml:space="preserve">The true share, which needs a decimal division; an integer over an integer drops the fraction.</w:t>
+              <w:t xml:space="preserve">This is the true share, which needs a decimal division, and an integer over an integer drops the fraction.</w:t>
             </w:r>
           </w:p>
           <w:p>

</xml_diff>